<commit_message>
Update TFM thesis document
</commit_message>
<xml_diff>
--- a/4_TFM_Thesis_Memory.docx
+++ b/4_TFM_Thesis_Memory.docx
@@ -10442,7 +10442,7 @@
         </w:rPr>
         <w:lastRenderedPageBreak/>
         <w:drawing>
-          <wp:anchor distT="0" distB="0" distL="114300" distR="114300" simplePos="0" relativeHeight="251658240" behindDoc="0" locked="0" layoutInCell="1" allowOverlap="1" wp14:anchorId="3B09428B" wp14:editId="0E0770F6">
+          <wp:anchor distT="0" distB="0" distL="114300" distR="114300" simplePos="0" relativeHeight="251658240" behindDoc="0" locked="0" layoutInCell="1" allowOverlap="1" wp14:anchorId="3B09428B" wp14:editId="18138782">
             <wp:simplePos x="0" y="0"/>
             <wp:positionH relativeFrom="page">
               <wp:align>center</wp:align>
@@ -20154,111 +20154,16 @@
           <w:szCs w:val="20"/>
           <w:lang w:val="en-US"/>
         </w:rPr>
-        <w:t xml:space="preserve">Several limitations qualify these conclusions and motivate future work. The </w:t>
-      </w:r>
-      <w:proofErr w:type="spellStart"/>
-      <w:r>
-        <w:rPr>
-          <w:rFonts w:ascii="Nimbus Roman" w:hAnsi="Nimbus Roman"/>
-          <w:sz w:val="20"/>
-          <w:szCs w:val="20"/>
-          <w:lang w:val="en-US"/>
-        </w:rPr>
-        <w:t>TabNet</w:t>
-      </w:r>
-      <w:proofErr w:type="spellEnd"/>
-      <w:r>
-        <w:rPr>
-          <w:rFonts w:ascii="Nimbus Roman" w:hAnsi="Nimbus Roman"/>
-          <w:sz w:val="20"/>
-          <w:szCs w:val="20"/>
-          <w:lang w:val="en-US"/>
-        </w:rPr>
-        <w:t xml:space="preserve"> model was trained with a single, commonly used hyperparameter configuration rather than an exhaustive search, so the reported explanation patterns are specific to this particular model fit and could shift somewhat under a differently regularized or differently sized network; replicating the benchmark across several trained models would strengthen the generality of the conclusions. The quantitative metrics were evaluated on a diagnostic subset of 200 instances (with the largest, most expensive method, SHAP </w:t>
-      </w:r>
-      <w:proofErr w:type="spellStart"/>
-      <w:r>
-        <w:rPr>
-          <w:rFonts w:ascii="Nimbus Roman" w:hAnsi="Nimbus Roman"/>
-          <w:sz w:val="20"/>
-          <w:szCs w:val="20"/>
-          <w:lang w:val="en-US"/>
-        </w:rPr>
-        <w:t>KernelExplainer</w:t>
-      </w:r>
-      <w:proofErr w:type="spellEnd"/>
-      <w:r>
-        <w:rPr>
-          <w:rFonts w:ascii="Nimbus Roman" w:hAnsi="Nimbus Roman"/>
-          <w:sz w:val="20"/>
-          <w:szCs w:val="20"/>
-          <w:lang w:val="en-US"/>
-        </w:rPr>
-        <w:t xml:space="preserve">, further restricted to subsets of 25–100 instances for the robustness metric), and although bootstrap confidence intervals partially address estimation uncertainty, a larger evaluation budget would tighten these intervals further, particularly for LIME. The proxy-risk discussion in Section V-L identifies fairness as a first-class concern raised by the explanation evidence but does not itself execute a full fairness audit against protected or protected-adjacent attributes; a natural extension of this work is to combine the explainability benchmark developed here with the group-fairness metrics (e.g., predictive equality across an age-based protected group, as used in the original BAF paper [8]) to jointly assess whether the categorical variables identified in Section V-C and V-J introduce disparate impact across groups. Finally, this thesis relied on manually implemented fidelity, robustness and stability metrics after finding the </w:t>
-      </w:r>
-      <w:proofErr w:type="spellStart"/>
-      <w:r>
-        <w:rPr>
-          <w:rFonts w:ascii="Nimbus Roman" w:hAnsi="Nimbus Roman"/>
-          <w:sz w:val="20"/>
-          <w:szCs w:val="20"/>
-          <w:lang w:val="en-US"/>
-        </w:rPr>
-        <w:t>Quantus</w:t>
-      </w:r>
-      <w:proofErr w:type="spellEnd"/>
-      <w:r>
-        <w:rPr>
-          <w:rFonts w:ascii="Nimbus Roman" w:hAnsi="Nimbus Roman"/>
-          <w:sz w:val="20"/>
-          <w:szCs w:val="20"/>
-          <w:lang w:val="en-US"/>
-        </w:rPr>
-        <w:t xml:space="preserve"> library incompatible with the flat, one-hot encoded tabular arrays used here; adapting </w:t>
-      </w:r>
-      <w:proofErr w:type="spellStart"/>
-      <w:r>
-        <w:rPr>
-          <w:rFonts w:ascii="Nimbus Roman" w:hAnsi="Nimbus Roman"/>
-          <w:sz w:val="20"/>
-          <w:szCs w:val="20"/>
-          <w:lang w:val="en-US"/>
-        </w:rPr>
-        <w:t>Quantus</w:t>
-      </w:r>
-      <w:proofErr w:type="spellEnd"/>
-      <w:r>
-        <w:rPr>
-          <w:rFonts w:ascii="Nimbus Roman" w:hAnsi="Nimbus Roman"/>
-          <w:sz w:val="20"/>
-          <w:szCs w:val="20"/>
-          <w:lang w:val="en-US"/>
-        </w:rPr>
-        <w:t xml:space="preserve"> or </w:t>
-      </w:r>
-      <w:proofErr w:type="spellStart"/>
-      <w:r>
-        <w:rPr>
-          <w:rFonts w:ascii="Nimbus Roman" w:hAnsi="Nimbus Roman"/>
-          <w:sz w:val="20"/>
-          <w:szCs w:val="20"/>
-          <w:lang w:val="en-US"/>
-        </w:rPr>
-        <w:t>OpenXAI</w:t>
-      </w:r>
-      <w:proofErr w:type="spellEnd"/>
-      <w:r>
-        <w:rPr>
-          <w:rFonts w:ascii="Nimbus Roman" w:hAnsi="Nimbus Roman"/>
-          <w:sz w:val="20"/>
-          <w:szCs w:val="20"/>
-          <w:lang w:val="en-US"/>
-        </w:rPr>
-        <w:t xml:space="preserve"> to this representation, or contributing a one-hot-aware perturbation mode upstream to one of these libraries, would improve reproducibility and comparability with other tabular XAI benchmarks in the wider research community. </w:t>
-      </w:r>
-    </w:p>
-    <w:p>
-      <w:pPr>
+        <w:t>Several limitations qualify these conclusions and motivate future work:</w:t>
+      </w:r>
+    </w:p>
+    <w:p>
+      <w:pPr>
+        <w:pStyle w:val="Prrafodelista"/>
+        <w:numPr>
+          <w:ilvl w:val="0"/>
+          <w:numId w:val="6"/>
+        </w:numPr>
         <w:spacing w:after="45" w:line="212" w:lineRule="auto"/>
         <w:jc w:val="both"/>
         <w:rPr>
@@ -20271,11 +20176,22 @@
       <w:r>
         <w:rPr>
           <w:rFonts w:ascii="Nimbus Roman" w:hAnsi="Nimbus Roman"/>
-          <w:sz w:val="20"/>
-          <w:szCs w:val="20"/>
-          <w:lang w:val="en-US"/>
-        </w:rPr>
-        <w:t xml:space="preserve">A further direction, noted in Section III-C, is a controlled ablation training </w:t>
+          <w:b/>
+          <w:bCs/>
+          <w:sz w:val="20"/>
+          <w:szCs w:val="20"/>
+          <w:lang w:val="en-US"/>
+        </w:rPr>
+        <w:t>Single hyperparameter configuration.</w:t>
+      </w:r>
+      <w:r>
+        <w:rPr>
+          <w:rFonts w:ascii="Nimbus Roman" w:hAnsi="Nimbus Roman"/>
+          <w:sz w:val="20"/>
+          <w:szCs w:val="20"/>
+          <w:lang w:val="en-US"/>
+        </w:rPr>
+        <w:t xml:space="preserve"> The </w:t>
       </w:r>
       <w:proofErr w:type="spellStart"/>
       <w:r>
@@ -20295,140 +20211,16 @@
           <w:szCs w:val="20"/>
           <w:lang w:val="en-US"/>
         </w:rPr>
-        <w:t xml:space="preserve"> with class weighting instead of SMOTE, holding architecture, preprocessing and evaluation protocol fixed, to directly compare the two imbalance-handling strategies rather than relying on SMOTE's result alone. </w:t>
-      </w:r>
-      <w:r>
-        <w:rPr>
-          <w:rFonts w:ascii="Nimbus Roman" w:hAnsi="Nimbus Roman"/>
-          <w:sz w:val="20"/>
-          <w:szCs w:val="20"/>
-          <w:lang w:val="en-US"/>
-        </w:rPr>
-        <w:t xml:space="preserve">A related and more direct extension targets the model itself rather than the training-set distribution: at the default 0.5 threshold </w:t>
-      </w:r>
-      <w:proofErr w:type="spellStart"/>
-      <w:r>
-        <w:rPr>
-          <w:rFonts w:ascii="Nimbus Roman" w:hAnsi="Nimbus Roman"/>
-          <w:sz w:val="20"/>
-          <w:szCs w:val="20"/>
-          <w:lang w:val="en-US"/>
-        </w:rPr>
-        <w:t>TabNet</w:t>
-      </w:r>
-      <w:proofErr w:type="spellEnd"/>
-      <w:r>
-        <w:rPr>
-          <w:rFonts w:ascii="Nimbus Roman" w:hAnsi="Nimbus Roman"/>
-          <w:sz w:val="20"/>
-          <w:szCs w:val="20"/>
-          <w:lang w:val="en-US"/>
-        </w:rPr>
-        <w:t xml:space="preserve"> still recalls only 56.4% of fraud cases at a precision of 9.2% (Section V-A), showing that SMOTE alone does not fully compensate for the dataset's imbalance at the operating-point level, even though it yields a good ranking model (AUC-ROC 0.85). A preliminary exploration of this direction, reported in a companion notebook outside the main thesis pipeline, trained </w:t>
-      </w:r>
-      <w:proofErr w:type="spellStart"/>
-      <w:r>
-        <w:rPr>
-          <w:rFonts w:ascii="Nimbus Roman" w:hAnsi="Nimbus Roman"/>
-          <w:sz w:val="20"/>
-          <w:szCs w:val="20"/>
-          <w:lang w:val="en-US"/>
-        </w:rPr>
-        <w:t>TabNet</w:t>
-      </w:r>
-      <w:proofErr w:type="spellEnd"/>
-      <w:r>
-        <w:rPr>
-          <w:rFonts w:ascii="Nimbus Roman" w:hAnsi="Nimbus Roman"/>
-          <w:sz w:val="20"/>
-          <w:szCs w:val="20"/>
-          <w:lang w:val="en-US"/>
-        </w:rPr>
-        <w:t xml:space="preserve"> directly on the original, un-resampled data with three imbalance-aware losses proposed by </w:t>
-      </w:r>
-      <w:proofErr w:type="spellStart"/>
-      <w:r>
-        <w:rPr>
-          <w:rFonts w:ascii="Nimbus Roman" w:hAnsi="Nimbus Roman"/>
-          <w:sz w:val="20"/>
-          <w:szCs w:val="20"/>
-          <w:lang w:val="en-US"/>
-        </w:rPr>
-        <w:t>Kanász</w:t>
-      </w:r>
-      <w:proofErr w:type="spellEnd"/>
-      <w:r>
-        <w:rPr>
-          <w:rFonts w:ascii="Nimbus Roman" w:hAnsi="Nimbus Roman"/>
-          <w:sz w:val="20"/>
-          <w:szCs w:val="20"/>
-          <w:lang w:val="en-US"/>
-        </w:rPr>
-        <w:t xml:space="preserve"> et al. [20]: Focal Loss, Influence-Balanced (IB) Loss, and a boundary-vicinity-weighted loss inspired by their </w:t>
-      </w:r>
-      <w:proofErr w:type="spellStart"/>
-      <w:r>
-        <w:rPr>
-          <w:rFonts w:ascii="Nimbus Roman" w:hAnsi="Nimbus Roman"/>
-          <w:sz w:val="20"/>
-          <w:szCs w:val="20"/>
-          <w:lang w:val="en-US"/>
-        </w:rPr>
-        <w:t>BVSLoss</w:t>
-      </w:r>
-      <w:proofErr w:type="spellEnd"/>
-      <w:r>
-        <w:rPr>
-          <w:rFonts w:ascii="Nimbus Roman" w:hAnsi="Nimbus Roman"/>
-          <w:sz w:val="20"/>
-          <w:szCs w:val="20"/>
-          <w:lang w:val="en-US"/>
-        </w:rPr>
-        <w:t xml:space="preserve">. Results were mixed rather than uniformly better: Focal Loss improved AUC-ROC, precision and F1 over the SMOTE baseline at a small recall cost; the </w:t>
-      </w:r>
-      <w:proofErr w:type="spellStart"/>
-      <w:r>
-        <w:rPr>
-          <w:rFonts w:ascii="Nimbus Roman" w:hAnsi="Nimbus Roman"/>
-          <w:sz w:val="20"/>
-          <w:szCs w:val="20"/>
-          <w:lang w:val="en-US"/>
-        </w:rPr>
-        <w:t>BVSLoss</w:t>
-      </w:r>
-      <w:proofErr w:type="spellEnd"/>
-      <w:r>
-        <w:rPr>
-          <w:rFonts w:ascii="Nimbus Roman" w:hAnsi="Nimbus Roman"/>
-          <w:sz w:val="20"/>
-          <w:szCs w:val="20"/>
-          <w:lang w:val="en-US"/>
-        </w:rPr>
-        <w:t xml:space="preserve">-inspired variant raised recall to 75.8% and reached the best geometric mean of sensitivity and specificity, at a substantial precision cost; and IB Loss reached the highest AUC-ROC (0.8818) yet collapsed to 2% recall at the 0.5 threshold, an apparent threshold-calibration failure rather than a learning failure. None of the three is validated enough, single run, untuned hyperparameters, unverified </w:t>
-      </w:r>
-      <w:proofErr w:type="spellStart"/>
-      <w:r>
-        <w:rPr>
-          <w:rFonts w:ascii="Nimbus Roman" w:hAnsi="Nimbus Roman"/>
-          <w:sz w:val="20"/>
-          <w:szCs w:val="20"/>
-          <w:lang w:val="en-US"/>
-        </w:rPr>
-        <w:t>BVSLoss</w:t>
-      </w:r>
-      <w:proofErr w:type="spellEnd"/>
-      <w:r>
-        <w:rPr>
-          <w:rFonts w:ascii="Nimbus Roman" w:hAnsi="Nimbus Roman"/>
-          <w:sz w:val="20"/>
-          <w:szCs w:val="20"/>
-          <w:lang w:val="en-US"/>
-        </w:rPr>
-        <w:t xml:space="preserve"> formula, to replace the reported model; per-model threshold tuning, hyperparameter search, and, if a variant is adopted, a full re-run of the XAI benchmark on the resulting model remain future work.</w:t>
-      </w:r>
-    </w:p>
-    <w:p>
-      <w:pPr>
+        <w:t xml:space="preserve"> model was trained with a single, commonly used hyperparameter configuration rather than an exhaustive search, so the reported explanation patterns are specific to this particular model fit and could shift somewhat under a differently regularized or differently sized network; replicating the benchmark across several trained models would strengthen the generality of the conclusions.</w:t>
+      </w:r>
+    </w:p>
+    <w:p>
+      <w:pPr>
+        <w:pStyle w:val="Prrafodelista"/>
+        <w:numPr>
+          <w:ilvl w:val="0"/>
+          <w:numId w:val="6"/>
+        </w:numPr>
         <w:spacing w:after="45" w:line="212" w:lineRule="auto"/>
         <w:jc w:val="both"/>
         <w:rPr>
@@ -20438,17 +20230,435 @@
           <w:lang w:val="en-US"/>
         </w:rPr>
       </w:pPr>
-    </w:p>
-    <w:p>
-      <w:pPr>
+      <w:r>
+        <w:rPr>
+          <w:rFonts w:ascii="Nimbus Roman" w:hAnsi="Nimbus Roman"/>
+          <w:b/>
+          <w:bCs/>
+          <w:sz w:val="20"/>
+          <w:szCs w:val="20"/>
+          <w:lang w:val="en-US"/>
+        </w:rPr>
+        <w:t>Evaluation budget.</w:t>
+      </w:r>
+      <w:r>
+        <w:rPr>
+          <w:rFonts w:ascii="Nimbus Roman" w:hAnsi="Nimbus Roman"/>
+          <w:sz w:val="20"/>
+          <w:szCs w:val="20"/>
+          <w:lang w:val="en-US"/>
+        </w:rPr>
+        <w:t xml:space="preserve"> The quantitative metrics were evaluated on a diagnostic subset of 200 instances (with the largest, most expensive method, SHAP </w:t>
+      </w:r>
+      <w:proofErr w:type="spellStart"/>
+      <w:r>
+        <w:rPr>
+          <w:rFonts w:ascii="Nimbus Roman" w:hAnsi="Nimbus Roman"/>
+          <w:sz w:val="20"/>
+          <w:szCs w:val="20"/>
+          <w:lang w:val="en-US"/>
+        </w:rPr>
+        <w:t>KernelExplainer</w:t>
+      </w:r>
+      <w:proofErr w:type="spellEnd"/>
+      <w:r>
+        <w:rPr>
+          <w:rFonts w:ascii="Nimbus Roman" w:hAnsi="Nimbus Roman"/>
+          <w:sz w:val="20"/>
+          <w:szCs w:val="20"/>
+          <w:lang w:val="en-US"/>
+        </w:rPr>
+        <w:t>, further restricted to subsets of 25–100 instances for the robustness metric), and although bootstrap confidence intervals partially address estimation uncertainty, a larger evaluation budget would tighten these intervals further, particularly for LIME.</w:t>
+      </w:r>
+    </w:p>
+    <w:p>
+      <w:pPr>
+        <w:pStyle w:val="Prrafodelista"/>
+        <w:numPr>
+          <w:ilvl w:val="0"/>
+          <w:numId w:val="6"/>
+        </w:numPr>
         <w:spacing w:after="45" w:line="212" w:lineRule="auto"/>
         <w:jc w:val="both"/>
         <w:rPr>
           <w:rFonts w:ascii="Nimbus Roman" w:hAnsi="Nimbus Roman"/>
-          <w:lang w:val="en-US"/>
-        </w:rPr>
-      </w:pPr>
-      <w:r>
+          <w:sz w:val="20"/>
+          <w:szCs w:val="20"/>
+          <w:lang w:val="en-US"/>
+        </w:rPr>
+      </w:pPr>
+      <w:r>
+        <w:rPr>
+          <w:rFonts w:ascii="Nimbus Roman" w:hAnsi="Nimbus Roman"/>
+          <w:b/>
+          <w:bCs/>
+          <w:sz w:val="20"/>
+          <w:szCs w:val="20"/>
+          <w:lang w:val="en-US"/>
+        </w:rPr>
+        <w:t>Fairness audit.</w:t>
+      </w:r>
+      <w:r>
+        <w:rPr>
+          <w:rFonts w:ascii="Nimbus Roman" w:hAnsi="Nimbus Roman"/>
+          <w:sz w:val="20"/>
+          <w:szCs w:val="20"/>
+          <w:lang w:val="en-US"/>
+        </w:rPr>
+        <w:t xml:space="preserve"> The proxy-risk discussion in Section V-L identifies fairness as a first-class concern raised by the explanation evidence but does not itself execute a full fairness audit against protected or protected-adjacent attributes; a natural extension of this work is to combine the explainability benchmark developed here with the group-fairness metrics (e.g., predictive equality across an age-based protected group, as used in the original BAF paper [8]) to jointly assess whether the categorical variables identified in Section V-C and V-J introduce disparate impact across groups.</w:t>
+      </w:r>
+    </w:p>
+    <w:p>
+      <w:pPr>
+        <w:pStyle w:val="Prrafodelista"/>
+        <w:numPr>
+          <w:ilvl w:val="0"/>
+          <w:numId w:val="6"/>
+        </w:numPr>
+        <w:spacing w:after="45" w:line="212" w:lineRule="auto"/>
+        <w:jc w:val="both"/>
+        <w:rPr>
+          <w:rFonts w:ascii="Nimbus Roman" w:hAnsi="Nimbus Roman"/>
+          <w:sz w:val="20"/>
+          <w:szCs w:val="20"/>
+          <w:lang w:val="en-US"/>
+        </w:rPr>
+      </w:pPr>
+      <w:r>
+        <w:rPr>
+          <w:rFonts w:ascii="Nimbus Roman" w:hAnsi="Nimbus Roman"/>
+          <w:b/>
+          <w:bCs/>
+          <w:sz w:val="20"/>
+          <w:szCs w:val="20"/>
+          <w:lang w:val="en-US"/>
+        </w:rPr>
+        <w:t>Metric library compatibility.</w:t>
+      </w:r>
+      <w:r>
+        <w:rPr>
+          <w:rFonts w:ascii="Nimbus Roman" w:hAnsi="Nimbus Roman"/>
+          <w:sz w:val="20"/>
+          <w:szCs w:val="20"/>
+          <w:lang w:val="en-US"/>
+        </w:rPr>
+        <w:t xml:space="preserve"> This thesis relied on manually implemented fidelity, robustness and stability metrics after finding the </w:t>
+      </w:r>
+      <w:proofErr w:type="spellStart"/>
+      <w:r>
+        <w:rPr>
+          <w:rFonts w:ascii="Nimbus Roman" w:hAnsi="Nimbus Roman"/>
+          <w:sz w:val="20"/>
+          <w:szCs w:val="20"/>
+          <w:lang w:val="en-US"/>
+        </w:rPr>
+        <w:t>Quantus</w:t>
+      </w:r>
+      <w:proofErr w:type="spellEnd"/>
+      <w:r>
+        <w:rPr>
+          <w:rFonts w:ascii="Nimbus Roman" w:hAnsi="Nimbus Roman"/>
+          <w:sz w:val="20"/>
+          <w:szCs w:val="20"/>
+          <w:lang w:val="en-US"/>
+        </w:rPr>
+        <w:t xml:space="preserve"> library incompatible with the flat, one-hot encoded tabular arrays used here; adapting </w:t>
+      </w:r>
+      <w:proofErr w:type="spellStart"/>
+      <w:r>
+        <w:rPr>
+          <w:rFonts w:ascii="Nimbus Roman" w:hAnsi="Nimbus Roman"/>
+          <w:sz w:val="20"/>
+          <w:szCs w:val="20"/>
+          <w:lang w:val="en-US"/>
+        </w:rPr>
+        <w:t>Quantus</w:t>
+      </w:r>
+      <w:proofErr w:type="spellEnd"/>
+      <w:r>
+        <w:rPr>
+          <w:rFonts w:ascii="Nimbus Roman" w:hAnsi="Nimbus Roman"/>
+          <w:sz w:val="20"/>
+          <w:szCs w:val="20"/>
+          <w:lang w:val="en-US"/>
+        </w:rPr>
+        <w:t xml:space="preserve"> or </w:t>
+      </w:r>
+      <w:proofErr w:type="spellStart"/>
+      <w:r>
+        <w:rPr>
+          <w:rFonts w:ascii="Nimbus Roman" w:hAnsi="Nimbus Roman"/>
+          <w:sz w:val="20"/>
+          <w:szCs w:val="20"/>
+          <w:lang w:val="en-US"/>
+        </w:rPr>
+        <w:t>OpenXAI</w:t>
+      </w:r>
+      <w:proofErr w:type="spellEnd"/>
+      <w:r>
+        <w:rPr>
+          <w:rFonts w:ascii="Nimbus Roman" w:hAnsi="Nimbus Roman"/>
+          <w:sz w:val="20"/>
+          <w:szCs w:val="20"/>
+          <w:lang w:val="en-US"/>
+        </w:rPr>
+        <w:t xml:space="preserve"> to this representation, or contributing a one-hot-aware perturbation mode upstream to one of these libraries, would improve reproducibility and comparability with other tabular XAI benchmarks in the wider research community.</w:t>
+      </w:r>
+    </w:p>
+    <w:p>
+      <w:pPr>
+        <w:pStyle w:val="Prrafodelista"/>
+        <w:numPr>
+          <w:ilvl w:val="0"/>
+          <w:numId w:val="6"/>
+        </w:numPr>
+        <w:spacing w:after="45" w:line="212" w:lineRule="auto"/>
+        <w:jc w:val="both"/>
+        <w:rPr>
+          <w:rFonts w:ascii="Nimbus Roman" w:hAnsi="Nimbus Roman"/>
+          <w:sz w:val="20"/>
+          <w:szCs w:val="20"/>
+          <w:lang w:val="en-US"/>
+        </w:rPr>
+      </w:pPr>
+      <w:r>
+        <w:rPr>
+          <w:rFonts w:ascii="Nimbus Roman" w:hAnsi="Nimbus Roman"/>
+          <w:b/>
+          <w:bCs/>
+          <w:sz w:val="20"/>
+          <w:szCs w:val="20"/>
+          <w:lang w:val="en-US"/>
+        </w:rPr>
+        <w:t>Class weighting ablation.</w:t>
+      </w:r>
+      <w:r>
+        <w:rPr>
+          <w:rFonts w:ascii="Nimbus Roman" w:hAnsi="Nimbus Roman"/>
+          <w:sz w:val="20"/>
+          <w:szCs w:val="20"/>
+          <w:lang w:val="en-US"/>
+        </w:rPr>
+        <w:t xml:space="preserve"> A further direction, noted in Section III-C, is a controlled ablation training </w:t>
+      </w:r>
+      <w:proofErr w:type="spellStart"/>
+      <w:r>
+        <w:rPr>
+          <w:rFonts w:ascii="Nimbus Roman" w:hAnsi="Nimbus Roman"/>
+          <w:sz w:val="20"/>
+          <w:szCs w:val="20"/>
+          <w:lang w:val="en-US"/>
+        </w:rPr>
+        <w:t>TabNet</w:t>
+      </w:r>
+      <w:proofErr w:type="spellEnd"/>
+      <w:r>
+        <w:rPr>
+          <w:rFonts w:ascii="Nimbus Roman" w:hAnsi="Nimbus Roman"/>
+          <w:sz w:val="20"/>
+          <w:szCs w:val="20"/>
+          <w:lang w:val="en-US"/>
+        </w:rPr>
+        <w:t xml:space="preserve"> with class weighting instead of SMOTE, holding architecture, preprocessing and evaluation protocol fixed, to directly compare the two imbalance-handling strategies rather than relying on SMOTE's result alone.</w:t>
+      </w:r>
+    </w:p>
+    <w:p>
+      <w:pPr>
+        <w:pStyle w:val="Prrafodelista"/>
+        <w:numPr>
+          <w:ilvl w:val="0"/>
+          <w:numId w:val="6"/>
+        </w:numPr>
+        <w:spacing w:after="45" w:line="212" w:lineRule="auto"/>
+        <w:jc w:val="both"/>
+        <w:rPr>
+          <w:rFonts w:ascii="Nimbus Roman" w:hAnsi="Nimbus Roman"/>
+          <w:sz w:val="20"/>
+          <w:szCs w:val="20"/>
+          <w:lang w:val="en-US"/>
+        </w:rPr>
+      </w:pPr>
+      <w:r>
+        <w:rPr>
+          <w:rFonts w:ascii="Nimbus Roman" w:hAnsi="Nimbus Roman"/>
+          <w:b/>
+          <w:bCs/>
+          <w:sz w:val="20"/>
+          <w:szCs w:val="20"/>
+          <w:lang w:val="en-US"/>
+        </w:rPr>
+        <w:t>Model-level imbalance handling.</w:t>
+      </w:r>
+      <w:r>
+        <w:rPr>
+          <w:rFonts w:ascii="Nimbus Roman" w:hAnsi="Nimbus Roman"/>
+          <w:sz w:val="20"/>
+          <w:szCs w:val="20"/>
+          <w:lang w:val="en-US"/>
+        </w:rPr>
+        <w:t xml:space="preserve"> A related and more direct extension targets the model itself rather than the training-set distribution: at the default 0.5 threshold </w:t>
+      </w:r>
+      <w:proofErr w:type="spellStart"/>
+      <w:r>
+        <w:rPr>
+          <w:rFonts w:ascii="Nimbus Roman" w:hAnsi="Nimbus Roman"/>
+          <w:sz w:val="20"/>
+          <w:szCs w:val="20"/>
+          <w:lang w:val="en-US"/>
+        </w:rPr>
+        <w:t>TabNet</w:t>
+      </w:r>
+      <w:proofErr w:type="spellEnd"/>
+      <w:r>
+        <w:rPr>
+          <w:rFonts w:ascii="Nimbus Roman" w:hAnsi="Nimbus Roman"/>
+          <w:sz w:val="20"/>
+          <w:szCs w:val="20"/>
+          <w:lang w:val="en-US"/>
+        </w:rPr>
+        <w:t xml:space="preserve"> still recalls only 56.4% of fraud cases at a precision of 9.2% (Section V-A), showing that SMOTE alone does not fully compensate for the dataset's imbalance at the operating-point level, even though it yields a good ranking model (AUC-ROC 0.85). A preliminary exploration of this direction, reported in a companion notebook outside the main thesis pipeline, trained </w:t>
+      </w:r>
+      <w:proofErr w:type="spellStart"/>
+      <w:r>
+        <w:rPr>
+          <w:rFonts w:ascii="Nimbus Roman" w:hAnsi="Nimbus Roman"/>
+          <w:sz w:val="20"/>
+          <w:szCs w:val="20"/>
+          <w:lang w:val="en-US"/>
+        </w:rPr>
+        <w:t>TabNet</w:t>
+      </w:r>
+      <w:proofErr w:type="spellEnd"/>
+      <w:r>
+        <w:rPr>
+          <w:rFonts w:ascii="Nimbus Roman" w:hAnsi="Nimbus Roman"/>
+          <w:sz w:val="20"/>
+          <w:szCs w:val="20"/>
+          <w:lang w:val="en-US"/>
+        </w:rPr>
+        <w:t xml:space="preserve"> directly on the original, un-resampled data with three imbalance-aware losses proposed by </w:t>
+      </w:r>
+      <w:proofErr w:type="spellStart"/>
+      <w:r>
+        <w:rPr>
+          <w:rFonts w:ascii="Nimbus Roman" w:hAnsi="Nimbus Roman"/>
+          <w:sz w:val="20"/>
+          <w:szCs w:val="20"/>
+          <w:lang w:val="en-US"/>
+        </w:rPr>
+        <w:t>Kanász</w:t>
+      </w:r>
+      <w:proofErr w:type="spellEnd"/>
+      <w:r>
+        <w:rPr>
+          <w:rFonts w:ascii="Nimbus Roman" w:hAnsi="Nimbus Roman"/>
+          <w:sz w:val="20"/>
+          <w:szCs w:val="20"/>
+          <w:lang w:val="en-US"/>
+        </w:rPr>
+        <w:t xml:space="preserve"> et al. [20]: Focal Loss, Influence-Balanced (IB) Loss, and a boundary-vicinity-weighted loss inspired by their </w:t>
+      </w:r>
+      <w:proofErr w:type="spellStart"/>
+      <w:r>
+        <w:rPr>
+          <w:rFonts w:ascii="Nimbus Roman" w:hAnsi="Nimbus Roman"/>
+          <w:sz w:val="20"/>
+          <w:szCs w:val="20"/>
+          <w:lang w:val="en-US"/>
+        </w:rPr>
+        <w:t>BVSLoss</w:t>
+      </w:r>
+      <w:proofErr w:type="spellEnd"/>
+      <w:r>
+        <w:rPr>
+          <w:rFonts w:ascii="Nimbus Roman" w:hAnsi="Nimbus Roman"/>
+          <w:sz w:val="20"/>
+          <w:szCs w:val="20"/>
+          <w:lang w:val="en-US"/>
+        </w:rPr>
+        <w:t xml:space="preserve">. Results were mixed rather than uniformly better: Focal Loss improved AUC-ROC, precision and F1 over the SMOTE baseline at a small recall cost; the </w:t>
+      </w:r>
+      <w:proofErr w:type="spellStart"/>
+      <w:r>
+        <w:rPr>
+          <w:rFonts w:ascii="Nimbus Roman" w:hAnsi="Nimbus Roman"/>
+          <w:sz w:val="20"/>
+          <w:szCs w:val="20"/>
+          <w:lang w:val="en-US"/>
+        </w:rPr>
+        <w:t>BVSLoss</w:t>
+      </w:r>
+      <w:proofErr w:type="spellEnd"/>
+      <w:r>
+        <w:rPr>
+          <w:rFonts w:ascii="Nimbus Roman" w:hAnsi="Nimbus Roman"/>
+          <w:sz w:val="20"/>
+          <w:szCs w:val="20"/>
+          <w:lang w:val="en-US"/>
+        </w:rPr>
+        <w:t xml:space="preserve">-inspired variant raised recall to 75.8% and reached the best geometric mean of sensitivity and specificity, at a substantial precision cost; and IB Loss reached the highest AUC-ROC (0.8818) yet collapsed to 2% recall at the 0.5 threshold, an apparent threshold-calibration failure rather than a learning failure. None of the three is validated enough, single run, untuned hyperparameters, unverified </w:t>
+      </w:r>
+      <w:proofErr w:type="spellStart"/>
+      <w:r>
+        <w:rPr>
+          <w:rFonts w:ascii="Nimbus Roman" w:hAnsi="Nimbus Roman"/>
+          <w:sz w:val="20"/>
+          <w:szCs w:val="20"/>
+          <w:lang w:val="en-US"/>
+        </w:rPr>
+        <w:t>BVSLoss</w:t>
+      </w:r>
+      <w:proofErr w:type="spellEnd"/>
+      <w:r>
+        <w:rPr>
+          <w:rFonts w:ascii="Nimbus Roman" w:hAnsi="Nimbus Roman"/>
+          <w:sz w:val="20"/>
+          <w:szCs w:val="20"/>
+          <w:lang w:val="en-US"/>
+        </w:rPr>
+        <w:t xml:space="preserve"> formula, to replace the reported model; per-model threshold tuning, hyperparameter search, and, if a variant is adopted, a full re-run of the XAI benchmark on the resulting model remain future work.</w:t>
+      </w:r>
+    </w:p>
+    <w:p>
+      <w:pPr>
+        <w:spacing w:after="45" w:line="212" w:lineRule="auto"/>
+        <w:jc w:val="both"/>
+        <w:rPr>
+          <w:rFonts w:ascii="Nimbus Roman" w:hAnsi="Nimbus Roman"/>
+          <w:sz w:val="20"/>
+          <w:szCs w:val="20"/>
+          <w:lang w:val="en-US"/>
+        </w:rPr>
+      </w:pPr>
+    </w:p>
+    <w:p>
+      <w:pPr>
+        <w:spacing w:after="45" w:line="212" w:lineRule="auto"/>
+        <w:jc w:val="both"/>
+        <w:rPr>
+          <w:rFonts w:ascii="Nimbus Roman" w:hAnsi="Nimbus Roman"/>
+          <w:sz w:val="20"/>
+          <w:szCs w:val="20"/>
+          <w:lang w:val="en-US"/>
+        </w:rPr>
+      </w:pPr>
+    </w:p>
+    <w:p>
+      <w:pPr>
+        <w:spacing w:after="45" w:line="212" w:lineRule="auto"/>
+        <w:jc w:val="both"/>
+        <w:rPr>
+          <w:rFonts w:ascii="Nimbus Roman" w:hAnsi="Nimbus Roman"/>
+          <w:sz w:val="20"/>
+          <w:szCs w:val="20"/>
+          <w:lang w:val="en-US"/>
+        </w:rPr>
+      </w:pPr>
+    </w:p>
+    <w:p>
+      <w:pPr>
+        <w:keepNext/>
+        <w:spacing w:before="190" w:after="90"/>
         <w:rPr>
           <w:rFonts w:ascii="Nimbus Roman" w:hAnsi="Nimbus Roman"/>
           <w:b/>
@@ -20457,58 +20667,6 @@
           <w:szCs w:val="26"/>
           <w:lang w:val="en-US"/>
         </w:rPr>
-        <w:t>APPENDIX A. REPRODUCIBILITY ARTIFACTS</w:t>
-      </w:r>
-    </w:p>
-    <w:p>
-      <w:pPr>
-        <w:spacing w:after="45" w:line="212" w:lineRule="auto"/>
-        <w:jc w:val="both"/>
-        <w:rPr>
-          <w:rFonts w:ascii="Nimbus Roman" w:hAnsi="Nimbus Roman"/>
-          <w:sz w:val="20"/>
-          <w:szCs w:val="20"/>
-          <w:lang w:val="en-US"/>
-        </w:rPr>
-      </w:pPr>
-      <w:r>
-        <w:rPr>
-          <w:rFonts w:ascii="Nimbus Roman" w:hAnsi="Nimbus Roman"/>
-          <w:sz w:val="20"/>
-          <w:szCs w:val="20"/>
-          <w:lang w:val="en-US"/>
-        </w:rPr>
-        <w:t xml:space="preserve">Both companion notebooks export their intermediate and final artifacts to disk for reproducibility: the EDA/training notebook exports the fitted preprocessing pipeline, trained </w:t>
-      </w:r>
-      <w:proofErr w:type="spellStart"/>
-      <w:r>
-        <w:rPr>
-          <w:rFonts w:ascii="Nimbus Roman" w:hAnsi="Nimbus Roman"/>
-          <w:sz w:val="20"/>
-          <w:szCs w:val="20"/>
-          <w:lang w:val="en-US"/>
-        </w:rPr>
-        <w:t>TabNet</w:t>
-      </w:r>
-      <w:proofErr w:type="spellEnd"/>
-      <w:r>
-        <w:rPr>
-          <w:rFonts w:ascii="Nimbus Roman" w:hAnsi="Nimbus Roman"/>
-          <w:sz w:val="20"/>
-          <w:szCs w:val="20"/>
-          <w:lang w:val="en-US"/>
-        </w:rPr>
-        <w:t xml:space="preserve"> weights, processed train/validation/test arrays, and the predictive-performance figures of Section V-A; the XAI benchmark notebook exports, per method, the raw attribution matrices (200-instance and 1,000-instance subsets), the corrected real-row SHAP background and Integrated Gradients baseline, naive and one-hot-aware fidelity, raw and relative robustness, stability, bootstrap confidence intervals, the grouped permutation-importance table, and every Section V figure at publication resolution. All random seeds are fixed at 42, and the QUICK_MODE flag (Section IV-A) allows a fast debug re-run before the full thesis-grade configuration reported here.</w:t>
-      </w:r>
-    </w:p>
-    <w:p>
-      <w:pPr>
-        <w:keepNext/>
-        <w:spacing w:before="190" w:after="90"/>
-        <w:rPr>
-          <w:rFonts w:ascii="Nimbus Roman" w:hAnsi="Nimbus Roman"/>
-          <w:lang w:val="en-US"/>
-        </w:rPr>
       </w:pPr>
       <w:r>
         <w:rPr>
@@ -20520,7 +20678,7 @@
           <w:lang w:val="en-US"/>
         </w:rPr>
         <w:lastRenderedPageBreak/>
-        <w:t xml:space="preserve">ACKNOWLEDGMENT. </w:t>
+        <w:t>APPENDIX A. REPRODUCIBILITY ARTIFACTS</w:t>
       </w:r>
     </w:p>
     <w:p>
@@ -20529,42 +20687,54 @@
         <w:jc w:val="both"/>
         <w:rPr>
           <w:rFonts w:ascii="Nimbus Roman" w:hAnsi="Nimbus Roman"/>
-          <w:lang w:val="en-US"/>
-        </w:rPr>
-      </w:pPr>
-      <w:r>
-        <w:rPr>
-          <w:rFonts w:ascii="Nimbus Roman" w:hAnsi="Nimbus Roman"/>
-          <w:sz w:val="20"/>
-          <w:szCs w:val="20"/>
-          <w:lang w:val="en-US"/>
-        </w:rPr>
-        <w:t xml:space="preserve">The author would like to thank Javier del Ser and José Manuel Nieto for their supervision and guidance throughout this thesis, and the Universidad de Málaga's Master's </w:t>
-      </w:r>
-      <w:proofErr w:type="spellStart"/>
-      <w:r>
-        <w:rPr>
-          <w:rFonts w:ascii="Nimbus Roman" w:hAnsi="Nimbus Roman"/>
-          <w:sz w:val="20"/>
-          <w:szCs w:val="20"/>
-          <w:lang w:val="en-US"/>
-        </w:rPr>
-        <w:t>programme</w:t>
-      </w:r>
-      <w:proofErr w:type="spellEnd"/>
-      <w:r>
-        <w:rPr>
-          <w:rFonts w:ascii="Nimbus Roman" w:hAnsi="Nimbus Roman"/>
-          <w:sz w:val="20"/>
-          <w:szCs w:val="20"/>
-          <w:lang w:val="en-US"/>
-        </w:rPr>
-        <w:t xml:space="preserve"> in Big Data, Artificial Intelligence and Data Engineering for the training that made this work possible.</w:t>
-      </w:r>
-    </w:p>
-    <w:p>
-      <w:pPr>
-        <w:spacing w:before="320" w:after="160"/>
+          <w:sz w:val="20"/>
+          <w:szCs w:val="20"/>
+          <w:lang w:val="en-US"/>
+        </w:rPr>
+      </w:pPr>
+      <w:r>
+        <w:rPr>
+          <w:rFonts w:ascii="Nimbus Roman" w:hAnsi="Nimbus Roman"/>
+          <w:sz w:val="20"/>
+          <w:szCs w:val="20"/>
+          <w:lang w:val="en-US"/>
+        </w:rPr>
+        <w:t xml:space="preserve">Both companion notebooks export reproducibility artifacts, including preprocessing pipelines, </w:t>
+      </w:r>
+      <w:proofErr w:type="spellStart"/>
+      <w:r>
+        <w:rPr>
+          <w:rFonts w:ascii="Nimbus Roman" w:hAnsi="Nimbus Roman"/>
+          <w:sz w:val="20"/>
+          <w:szCs w:val="20"/>
+          <w:lang w:val="en-US"/>
+        </w:rPr>
+        <w:t>TabNet</w:t>
+      </w:r>
+      <w:proofErr w:type="spellEnd"/>
+      <w:r>
+        <w:rPr>
+          <w:rFonts w:ascii="Nimbus Roman" w:hAnsi="Nimbus Roman"/>
+          <w:sz w:val="20"/>
+          <w:szCs w:val="20"/>
+          <w:lang w:val="en-US"/>
+        </w:rPr>
+        <w:t xml:space="preserve"> weights, processed datasets, attribution matrices, corrected SHAP backgrounds and Integrated Gradients baselines, fidelity, robustness, stability, confidence intervals, permutation importance, and publication-resolution figures. Random seeds are fixed at 42, while QUICK_MODE enables rapid debugging before full thesis-grade execution</w:t>
+      </w:r>
+      <w:r>
+        <w:rPr>
+          <w:rFonts w:ascii="Nimbus Roman" w:hAnsi="Nimbus Roman"/>
+          <w:sz w:val="20"/>
+          <w:szCs w:val="20"/>
+          <w:lang w:val="en-US"/>
+        </w:rPr>
+        <w:t>.</w:t>
+      </w:r>
+    </w:p>
+    <w:p>
+      <w:pPr>
+        <w:keepNext/>
+        <w:spacing w:before="190" w:after="90"/>
         <w:rPr>
           <w:rFonts w:ascii="Nimbus Roman" w:hAnsi="Nimbus Roman"/>
           <w:lang w:val="en-US"/>
@@ -20575,8 +20745,72 @@
           <w:rFonts w:ascii="Nimbus Roman" w:hAnsi="Nimbus Roman"/>
           <w:b/>
           <w:bCs/>
-          <w:sz w:val="27"/>
-          <w:szCs w:val="27"/>
+          <w:sz w:val="26"/>
+          <w:szCs w:val="26"/>
+          <w:lang w:val="en-US"/>
+        </w:rPr>
+        <w:t>ACKNOWLEDGMENT</w:t>
+      </w:r>
+    </w:p>
+    <w:p>
+      <w:pPr>
+        <w:spacing w:after="45" w:line="212" w:lineRule="auto"/>
+        <w:jc w:val="both"/>
+        <w:rPr>
+          <w:rFonts w:ascii="Nimbus Roman" w:hAnsi="Nimbus Roman"/>
+          <w:lang w:val="en-US"/>
+        </w:rPr>
+      </w:pPr>
+      <w:r>
+        <w:rPr>
+          <w:rFonts w:ascii="Nimbus Roman" w:hAnsi="Nimbus Roman"/>
+          <w:sz w:val="20"/>
+          <w:szCs w:val="20"/>
+          <w:lang w:val="en-US"/>
+        </w:rPr>
+        <w:t xml:space="preserve">The author would like to thank Javier del Ser and José Manuel Nieto for their supervision and guidance throughout this thesis, and the Universidad de Málaga's Master's </w:t>
+      </w:r>
+      <w:proofErr w:type="spellStart"/>
+      <w:r>
+        <w:rPr>
+          <w:rFonts w:ascii="Nimbus Roman" w:hAnsi="Nimbus Roman"/>
+          <w:sz w:val="20"/>
+          <w:szCs w:val="20"/>
+          <w:lang w:val="en-US"/>
+        </w:rPr>
+        <w:t>programme</w:t>
+      </w:r>
+      <w:proofErr w:type="spellEnd"/>
+      <w:r>
+        <w:rPr>
+          <w:rFonts w:ascii="Nimbus Roman" w:hAnsi="Nimbus Roman"/>
+          <w:sz w:val="20"/>
+          <w:szCs w:val="20"/>
+          <w:lang w:val="en-US"/>
+        </w:rPr>
+        <w:t xml:space="preserve"> for the training that made this work possible.</w:t>
+      </w:r>
+    </w:p>
+    <w:p>
+      <w:pPr>
+        <w:keepNext/>
+        <w:spacing w:before="190" w:after="90"/>
+        <w:rPr>
+          <w:rFonts w:ascii="Nimbus Roman" w:hAnsi="Nimbus Roman"/>
+          <w:b/>
+          <w:bCs/>
+          <w:sz w:val="26"/>
+          <w:szCs w:val="26"/>
+          <w:lang w:val="en-US"/>
+        </w:rPr>
+      </w:pPr>
+      <w:r>
+        <w:rPr>
+          <w:rFonts w:ascii="Nimbus Roman" w:hAnsi="Nimbus Roman"/>
+          <w:b/>
+          <w:bCs/>
+          <w:sz w:val="26"/>
+          <w:szCs w:val="26"/>
           <w:lang w:val="en-US"/>
         </w:rPr>
         <w:t>REFERENCES</w:t>
@@ -22003,6 +22237,291 @@
 <file path=word/numbering.xml><?xml version="1.0" encoding="utf-8"?>
 <w:numbering xmlns:wpc="http://schemas.microsoft.com/office/word/2010/wordprocessingCanvas" xmlns:cx="http://schemas.microsoft.com/office/drawing/2014/chartex" xmlns:cx1="http://schemas.microsoft.com/office/drawing/2015/9/8/chartex" xmlns:cx2="http://schemas.microsoft.com/office/drawing/2015/10/21/chartex" xmlns:cx3="http://schemas.microsoft.com/office/drawing/2016/5/9/chartex" xmlns:cx4="http://schemas.microsoft.com/office/drawing/2016/5/10/chartex" xmlns:cx5="http://schemas.microsoft.com/office/drawing/2016/5/11/chartex" xmlns:cx6="http://schemas.microsoft.com/office/drawing/2016/5/12/chartex" xmlns:cx7="http://schemas.microsoft.com/office/drawing/2016/5/13/chartex" xmlns:cx8="http://schemas.microsoft.com/office/drawing/2016/5/14/chartex" xmlns:mc="http://schemas.openxmlformats.org/markup-compatibility/2006" xmlns:aink="http://schemas.microsoft.com/office/drawing/2016/ink" xmlns:am3d="http://schemas.microsoft.com/office/drawing/2017/model3d" xmlns:o="urn:schemas-microsoft-com:office:office" xmlns:oel="http://schemas.microsoft.com/office/2019/extlst" xmlns:r="http://schemas.openxmlformats.org/officeDocument/2006/relationships" xmlns:m="http://schemas.openxmlformats.org/officeDocument/2006/math" xmlns:v="urn:schemas-microsoft-com:vml" xmlns:wp14="http://schemas.microsoft.com/office/word/2010/wordprocessingDrawing" xmlns:wp="http://schemas.openxmlformats.org/drawingml/2006/wordprocessingDrawing" xmlns:w10="urn:schemas-microsoft-com:office:word" xmlns:w="http://schemas.openxmlformats.org/wordprocessingml/2006/main" xmlns:w14="http://schemas.microsoft.com/office/word/2010/wordml" xmlns:w15="http://schemas.microsoft.com/office/word/2012/wordml" xmlns:w16cex="http://schemas.microsoft.com/office/word/2018/wordml/cex" xmlns:w16cid="http://schemas.microsoft.com/office/word/2016/wordml/cid" xmlns:w16="http://schemas.microsoft.com/office/word/2018/wordml" xmlns:w16sdtdh="http://schemas.microsoft.com/office/word/2020/wordml/sdtdatahash" xmlns:w16se="http://schemas.microsoft.com/office/word/2015/wordml/symex" xmlns:wpg="http://schemas.microsoft.com/office/word/2010/wordprocessingGroup" xmlns:wpi="http://schemas.microsoft.com/office/word/2010/wordprocessingInk" xmlns:wne="http://schemas.microsoft.com/office/word/2006/wordml" xmlns:wps="http://schemas.microsoft.com/office/word/2010/wordprocessingShape" mc:Ignorable="w14 w15 w16se w16cid w16 w16cex w16sdtdh wp14">
   <w:abstractNum w:abstractNumId="0" w15:restartNumberingAfterBreak="0">
+    <w:nsid w:val="0AA808FC"/>
+    <w:multiLevelType w:val="hybridMultilevel"/>
+    <w:tmpl w:val="B2FC2348"/>
+    <w:lvl w:ilvl="0" w:tplc="0C0A000F">
+      <w:start w:val="1"/>
+      <w:numFmt w:val="decimal"/>
+      <w:lvlText w:val="%1."/>
+      <w:lvlJc w:val="left"/>
+      <w:pPr>
+        <w:ind w:left="720" w:hanging="360"/>
+      </w:pPr>
+    </w:lvl>
+    <w:lvl w:ilvl="1" w:tplc="0C0A0019" w:tentative="1">
+      <w:start w:val="1"/>
+      <w:numFmt w:val="lowerLetter"/>
+      <w:lvlText w:val="%2."/>
+      <w:lvlJc w:val="left"/>
+      <w:pPr>
+        <w:ind w:left="1440" w:hanging="360"/>
+      </w:pPr>
+    </w:lvl>
+    <w:lvl w:ilvl="2" w:tplc="0C0A001B" w:tentative="1">
+      <w:start w:val="1"/>
+      <w:numFmt w:val="lowerRoman"/>
+      <w:lvlText w:val="%3."/>
+      <w:lvlJc w:val="right"/>
+      <w:pPr>
+        <w:ind w:left="2160" w:hanging="180"/>
+      </w:pPr>
+    </w:lvl>
+    <w:lvl w:ilvl="3" w:tplc="0C0A000F" w:tentative="1">
+      <w:start w:val="1"/>
+      <w:numFmt w:val="decimal"/>
+      <w:lvlText w:val="%4."/>
+      <w:lvlJc w:val="left"/>
+      <w:pPr>
+        <w:ind w:left="2880" w:hanging="360"/>
+      </w:pPr>
+    </w:lvl>
+    <w:lvl w:ilvl="4" w:tplc="0C0A0019" w:tentative="1">
+      <w:start w:val="1"/>
+      <w:numFmt w:val="lowerLetter"/>
+      <w:lvlText w:val="%5."/>
+      <w:lvlJc w:val="left"/>
+      <w:pPr>
+        <w:ind w:left="3600" w:hanging="360"/>
+      </w:pPr>
+    </w:lvl>
+    <w:lvl w:ilvl="5" w:tplc="0C0A001B" w:tentative="1">
+      <w:start w:val="1"/>
+      <w:numFmt w:val="lowerRoman"/>
+      <w:lvlText w:val="%6."/>
+      <w:lvlJc w:val="right"/>
+      <w:pPr>
+        <w:ind w:left="4320" w:hanging="180"/>
+      </w:pPr>
+    </w:lvl>
+    <w:lvl w:ilvl="6" w:tplc="0C0A000F" w:tentative="1">
+      <w:start w:val="1"/>
+      <w:numFmt w:val="decimal"/>
+      <w:lvlText w:val="%7."/>
+      <w:lvlJc w:val="left"/>
+      <w:pPr>
+        <w:ind w:left="5040" w:hanging="360"/>
+      </w:pPr>
+    </w:lvl>
+    <w:lvl w:ilvl="7" w:tplc="0C0A0019" w:tentative="1">
+      <w:start w:val="1"/>
+      <w:numFmt w:val="lowerLetter"/>
+      <w:lvlText w:val="%8."/>
+      <w:lvlJc w:val="left"/>
+      <w:pPr>
+        <w:ind w:left="5760" w:hanging="360"/>
+      </w:pPr>
+    </w:lvl>
+    <w:lvl w:ilvl="8" w:tplc="0C0A001B" w:tentative="1">
+      <w:start w:val="1"/>
+      <w:numFmt w:val="lowerRoman"/>
+      <w:lvlText w:val="%9."/>
+      <w:lvlJc w:val="right"/>
+      <w:pPr>
+        <w:ind w:left="6480" w:hanging="180"/>
+      </w:pPr>
+    </w:lvl>
+  </w:abstractNum>
+  <w:abstractNum w:abstractNumId="1" w15:restartNumberingAfterBreak="0">
+    <w:nsid w:val="31FD06E7"/>
+    <w:multiLevelType w:val="hybridMultilevel"/>
+    <w:tmpl w:val="E1C2826C"/>
+    <w:lvl w:ilvl="0" w:tplc="0C0A000F">
+      <w:start w:val="1"/>
+      <w:numFmt w:val="decimal"/>
+      <w:lvlText w:val="%1."/>
+      <w:lvlJc w:val="left"/>
+      <w:pPr>
+        <w:ind w:left="720" w:hanging="360"/>
+      </w:pPr>
+    </w:lvl>
+    <w:lvl w:ilvl="1" w:tplc="0C0A0019" w:tentative="1">
+      <w:start w:val="1"/>
+      <w:numFmt w:val="lowerLetter"/>
+      <w:lvlText w:val="%2."/>
+      <w:lvlJc w:val="left"/>
+      <w:pPr>
+        <w:ind w:left="1440" w:hanging="360"/>
+      </w:pPr>
+    </w:lvl>
+    <w:lvl w:ilvl="2" w:tplc="0C0A001B" w:tentative="1">
+      <w:start w:val="1"/>
+      <w:numFmt w:val="lowerRoman"/>
+      <w:lvlText w:val="%3."/>
+      <w:lvlJc w:val="right"/>
+      <w:pPr>
+        <w:ind w:left="2160" w:hanging="180"/>
+      </w:pPr>
+    </w:lvl>
+    <w:lvl w:ilvl="3" w:tplc="0C0A000F" w:tentative="1">
+      <w:start w:val="1"/>
+      <w:numFmt w:val="decimal"/>
+      <w:lvlText w:val="%4."/>
+      <w:lvlJc w:val="left"/>
+      <w:pPr>
+        <w:ind w:left="2880" w:hanging="360"/>
+      </w:pPr>
+    </w:lvl>
+    <w:lvl w:ilvl="4" w:tplc="0C0A0019" w:tentative="1">
+      <w:start w:val="1"/>
+      <w:numFmt w:val="lowerLetter"/>
+      <w:lvlText w:val="%5."/>
+      <w:lvlJc w:val="left"/>
+      <w:pPr>
+        <w:ind w:left="3600" w:hanging="360"/>
+      </w:pPr>
+    </w:lvl>
+    <w:lvl w:ilvl="5" w:tplc="0C0A001B" w:tentative="1">
+      <w:start w:val="1"/>
+      <w:numFmt w:val="lowerRoman"/>
+      <w:lvlText w:val="%6."/>
+      <w:lvlJc w:val="right"/>
+      <w:pPr>
+        <w:ind w:left="4320" w:hanging="180"/>
+      </w:pPr>
+    </w:lvl>
+    <w:lvl w:ilvl="6" w:tplc="0C0A000F" w:tentative="1">
+      <w:start w:val="1"/>
+      <w:numFmt w:val="decimal"/>
+      <w:lvlText w:val="%7."/>
+      <w:lvlJc w:val="left"/>
+      <w:pPr>
+        <w:ind w:left="5040" w:hanging="360"/>
+      </w:pPr>
+    </w:lvl>
+    <w:lvl w:ilvl="7" w:tplc="0C0A0019" w:tentative="1">
+      <w:start w:val="1"/>
+      <w:numFmt w:val="lowerLetter"/>
+      <w:lvlText w:val="%8."/>
+      <w:lvlJc w:val="left"/>
+      <w:pPr>
+        <w:ind w:left="5760" w:hanging="360"/>
+      </w:pPr>
+    </w:lvl>
+    <w:lvl w:ilvl="8" w:tplc="0C0A001B" w:tentative="1">
+      <w:start w:val="1"/>
+      <w:numFmt w:val="lowerRoman"/>
+      <w:lvlText w:val="%9."/>
+      <w:lvlJc w:val="right"/>
+      <w:pPr>
+        <w:ind w:left="6480" w:hanging="180"/>
+      </w:pPr>
+    </w:lvl>
+  </w:abstractNum>
+  <w:abstractNum w:abstractNumId="2" w15:restartNumberingAfterBreak="0">
+    <w:nsid w:val="45657AD5"/>
+    <w:multiLevelType w:val="hybridMultilevel"/>
+    <w:tmpl w:val="21B0E7D6"/>
+    <w:lvl w:ilvl="0" w:tplc="0C0A0001">
+      <w:start w:val="1"/>
+      <w:numFmt w:val="bullet"/>
+      <w:lvlText w:val=""/>
+      <w:lvlJc w:val="left"/>
+      <w:pPr>
+        <w:ind w:left="720" w:hanging="360"/>
+      </w:pPr>
+      <w:rPr>
+        <w:rFonts w:ascii="Symbol" w:hAnsi="Symbol" w:hint="default"/>
+      </w:rPr>
+    </w:lvl>
+    <w:lvl w:ilvl="1" w:tplc="0C0A0003" w:tentative="1">
+      <w:start w:val="1"/>
+      <w:numFmt w:val="bullet"/>
+      <w:lvlText w:val="o"/>
+      <w:lvlJc w:val="left"/>
+      <w:pPr>
+        <w:ind w:left="1440" w:hanging="360"/>
+      </w:pPr>
+      <w:rPr>
+        <w:rFonts w:ascii="Courier New" w:hAnsi="Courier New" w:cs="Courier New" w:hint="default"/>
+      </w:rPr>
+    </w:lvl>
+    <w:lvl w:ilvl="2" w:tplc="0C0A0005" w:tentative="1">
+      <w:start w:val="1"/>
+      <w:numFmt w:val="bullet"/>
+      <w:lvlText w:val=""/>
+      <w:lvlJc w:val="left"/>
+      <w:pPr>
+        <w:ind w:left="2160" w:hanging="360"/>
+      </w:pPr>
+      <w:rPr>
+        <w:rFonts w:ascii="Wingdings" w:hAnsi="Wingdings" w:hint="default"/>
+      </w:rPr>
+    </w:lvl>
+    <w:lvl w:ilvl="3" w:tplc="0C0A0001" w:tentative="1">
+      <w:start w:val="1"/>
+      <w:numFmt w:val="bullet"/>
+      <w:lvlText w:val=""/>
+      <w:lvlJc w:val="left"/>
+      <w:pPr>
+        <w:ind w:left="2880" w:hanging="360"/>
+      </w:pPr>
+      <w:rPr>
+        <w:rFonts w:ascii="Symbol" w:hAnsi="Symbol" w:hint="default"/>
+      </w:rPr>
+    </w:lvl>
+    <w:lvl w:ilvl="4" w:tplc="0C0A0003" w:tentative="1">
+      <w:start w:val="1"/>
+      <w:numFmt w:val="bullet"/>
+      <w:lvlText w:val="o"/>
+      <w:lvlJc w:val="left"/>
+      <w:pPr>
+        <w:ind w:left="3600" w:hanging="360"/>
+      </w:pPr>
+      <w:rPr>
+        <w:rFonts w:ascii="Courier New" w:hAnsi="Courier New" w:cs="Courier New" w:hint="default"/>
+      </w:rPr>
+    </w:lvl>
+    <w:lvl w:ilvl="5" w:tplc="0C0A0005" w:tentative="1">
+      <w:start w:val="1"/>
+      <w:numFmt w:val="bullet"/>
+      <w:lvlText w:val=""/>
+      <w:lvlJc w:val="left"/>
+      <w:pPr>
+        <w:ind w:left="4320" w:hanging="360"/>
+      </w:pPr>
+      <w:rPr>
+        <w:rFonts w:ascii="Wingdings" w:hAnsi="Wingdings" w:hint="default"/>
+      </w:rPr>
+    </w:lvl>
+    <w:lvl w:ilvl="6" w:tplc="0C0A0001" w:tentative="1">
+      <w:start w:val="1"/>
+      <w:numFmt w:val="bullet"/>
+      <w:lvlText w:val=""/>
+      <w:lvlJc w:val="left"/>
+      <w:pPr>
+        <w:ind w:left="5040" w:hanging="360"/>
+      </w:pPr>
+      <w:rPr>
+        <w:rFonts w:ascii="Symbol" w:hAnsi="Symbol" w:hint="default"/>
+      </w:rPr>
+    </w:lvl>
+    <w:lvl w:ilvl="7" w:tplc="0C0A0003" w:tentative="1">
+      <w:start w:val="1"/>
+      <w:numFmt w:val="bullet"/>
+      <w:lvlText w:val="o"/>
+      <w:lvlJc w:val="left"/>
+      <w:pPr>
+        <w:ind w:left="5760" w:hanging="360"/>
+      </w:pPr>
+      <w:rPr>
+        <w:rFonts w:ascii="Courier New" w:hAnsi="Courier New" w:cs="Courier New" w:hint="default"/>
+      </w:rPr>
+    </w:lvl>
+    <w:lvl w:ilvl="8" w:tplc="0C0A0005" w:tentative="1">
+      <w:start w:val="1"/>
+      <w:numFmt w:val="bullet"/>
+      <w:lvlText w:val=""/>
+      <w:lvlJc w:val="left"/>
+      <w:pPr>
+        <w:ind w:left="6480" w:hanging="360"/>
+      </w:pPr>
+      <w:rPr>
+        <w:rFonts w:ascii="Wingdings" w:hAnsi="Wingdings" w:hint="default"/>
+      </w:rPr>
+    </w:lvl>
+  </w:abstractNum>
+  <w:abstractNum w:abstractNumId="3" w15:restartNumberingAfterBreak="0">
     <w:nsid w:val="4E462551"/>
     <w:multiLevelType w:val="hybridMultilevel"/>
     <w:tmpl w:val="86B2CFC8"/>
@@ -22088,11 +22607,225 @@
       </w:pPr>
     </w:lvl>
   </w:abstractNum>
+  <w:abstractNum w:abstractNumId="4" w15:restartNumberingAfterBreak="0">
+    <w:nsid w:val="5A2B5E11"/>
+    <w:multiLevelType w:val="hybridMultilevel"/>
+    <w:tmpl w:val="0B16A7D0"/>
+    <w:lvl w:ilvl="0" w:tplc="0C0A0001">
+      <w:start w:val="1"/>
+      <w:numFmt w:val="bullet"/>
+      <w:lvlText w:val=""/>
+      <w:lvlJc w:val="left"/>
+      <w:pPr>
+        <w:ind w:left="720" w:hanging="360"/>
+      </w:pPr>
+      <w:rPr>
+        <w:rFonts w:ascii="Symbol" w:hAnsi="Symbol" w:hint="default"/>
+      </w:rPr>
+    </w:lvl>
+    <w:lvl w:ilvl="1" w:tplc="0C0A0003" w:tentative="1">
+      <w:start w:val="1"/>
+      <w:numFmt w:val="bullet"/>
+      <w:lvlText w:val="o"/>
+      <w:lvlJc w:val="left"/>
+      <w:pPr>
+        <w:ind w:left="1440" w:hanging="360"/>
+      </w:pPr>
+      <w:rPr>
+        <w:rFonts w:ascii="Courier New" w:hAnsi="Courier New" w:cs="Courier New" w:hint="default"/>
+      </w:rPr>
+    </w:lvl>
+    <w:lvl w:ilvl="2" w:tplc="0C0A0005" w:tentative="1">
+      <w:start w:val="1"/>
+      <w:numFmt w:val="bullet"/>
+      <w:lvlText w:val=""/>
+      <w:lvlJc w:val="left"/>
+      <w:pPr>
+        <w:ind w:left="2160" w:hanging="360"/>
+      </w:pPr>
+      <w:rPr>
+        <w:rFonts w:ascii="Wingdings" w:hAnsi="Wingdings" w:hint="default"/>
+      </w:rPr>
+    </w:lvl>
+    <w:lvl w:ilvl="3" w:tplc="0C0A0001" w:tentative="1">
+      <w:start w:val="1"/>
+      <w:numFmt w:val="bullet"/>
+      <w:lvlText w:val=""/>
+      <w:lvlJc w:val="left"/>
+      <w:pPr>
+        <w:ind w:left="2880" w:hanging="360"/>
+      </w:pPr>
+      <w:rPr>
+        <w:rFonts w:ascii="Symbol" w:hAnsi="Symbol" w:hint="default"/>
+      </w:rPr>
+    </w:lvl>
+    <w:lvl w:ilvl="4" w:tplc="0C0A0003" w:tentative="1">
+      <w:start w:val="1"/>
+      <w:numFmt w:val="bullet"/>
+      <w:lvlText w:val="o"/>
+      <w:lvlJc w:val="left"/>
+      <w:pPr>
+        <w:ind w:left="3600" w:hanging="360"/>
+      </w:pPr>
+      <w:rPr>
+        <w:rFonts w:ascii="Courier New" w:hAnsi="Courier New" w:cs="Courier New" w:hint="default"/>
+      </w:rPr>
+    </w:lvl>
+    <w:lvl w:ilvl="5" w:tplc="0C0A0005" w:tentative="1">
+      <w:start w:val="1"/>
+      <w:numFmt w:val="bullet"/>
+      <w:lvlText w:val=""/>
+      <w:lvlJc w:val="left"/>
+      <w:pPr>
+        <w:ind w:left="4320" w:hanging="360"/>
+      </w:pPr>
+      <w:rPr>
+        <w:rFonts w:ascii="Wingdings" w:hAnsi="Wingdings" w:hint="default"/>
+      </w:rPr>
+    </w:lvl>
+    <w:lvl w:ilvl="6" w:tplc="0C0A0001" w:tentative="1">
+      <w:start w:val="1"/>
+      <w:numFmt w:val="bullet"/>
+      <w:lvlText w:val=""/>
+      <w:lvlJc w:val="left"/>
+      <w:pPr>
+        <w:ind w:left="5040" w:hanging="360"/>
+      </w:pPr>
+      <w:rPr>
+        <w:rFonts w:ascii="Symbol" w:hAnsi="Symbol" w:hint="default"/>
+      </w:rPr>
+    </w:lvl>
+    <w:lvl w:ilvl="7" w:tplc="0C0A0003" w:tentative="1">
+      <w:start w:val="1"/>
+      <w:numFmt w:val="bullet"/>
+      <w:lvlText w:val="o"/>
+      <w:lvlJc w:val="left"/>
+      <w:pPr>
+        <w:ind w:left="5760" w:hanging="360"/>
+      </w:pPr>
+      <w:rPr>
+        <w:rFonts w:ascii="Courier New" w:hAnsi="Courier New" w:cs="Courier New" w:hint="default"/>
+      </w:rPr>
+    </w:lvl>
+    <w:lvl w:ilvl="8" w:tplc="0C0A0005" w:tentative="1">
+      <w:start w:val="1"/>
+      <w:numFmt w:val="bullet"/>
+      <w:lvlText w:val=""/>
+      <w:lvlJc w:val="left"/>
+      <w:pPr>
+        <w:ind w:left="6480" w:hanging="360"/>
+      </w:pPr>
+      <w:rPr>
+        <w:rFonts w:ascii="Wingdings" w:hAnsi="Wingdings" w:hint="default"/>
+      </w:rPr>
+    </w:lvl>
+  </w:abstractNum>
+  <w:abstractNum w:abstractNumId="5" w15:restartNumberingAfterBreak="0">
+    <w:nsid w:val="63C41950"/>
+    <w:multiLevelType w:val="hybridMultilevel"/>
+    <w:tmpl w:val="AE58F36A"/>
+    <w:lvl w:ilvl="0" w:tplc="0C0A000F">
+      <w:start w:val="1"/>
+      <w:numFmt w:val="decimal"/>
+      <w:lvlText w:val="%1."/>
+      <w:lvlJc w:val="left"/>
+      <w:pPr>
+        <w:ind w:left="360" w:hanging="360"/>
+      </w:pPr>
+    </w:lvl>
+    <w:lvl w:ilvl="1" w:tplc="0C0A0019" w:tentative="1">
+      <w:start w:val="1"/>
+      <w:numFmt w:val="lowerLetter"/>
+      <w:lvlText w:val="%2."/>
+      <w:lvlJc w:val="left"/>
+      <w:pPr>
+        <w:ind w:left="1080" w:hanging="360"/>
+      </w:pPr>
+    </w:lvl>
+    <w:lvl w:ilvl="2" w:tplc="0C0A001B" w:tentative="1">
+      <w:start w:val="1"/>
+      <w:numFmt w:val="lowerRoman"/>
+      <w:lvlText w:val="%3."/>
+      <w:lvlJc w:val="right"/>
+      <w:pPr>
+        <w:ind w:left="1800" w:hanging="180"/>
+      </w:pPr>
+    </w:lvl>
+    <w:lvl w:ilvl="3" w:tplc="0C0A000F" w:tentative="1">
+      <w:start w:val="1"/>
+      <w:numFmt w:val="decimal"/>
+      <w:lvlText w:val="%4."/>
+      <w:lvlJc w:val="left"/>
+      <w:pPr>
+        <w:ind w:left="2520" w:hanging="360"/>
+      </w:pPr>
+    </w:lvl>
+    <w:lvl w:ilvl="4" w:tplc="0C0A0019" w:tentative="1">
+      <w:start w:val="1"/>
+      <w:numFmt w:val="lowerLetter"/>
+      <w:lvlText w:val="%5."/>
+      <w:lvlJc w:val="left"/>
+      <w:pPr>
+        <w:ind w:left="3240" w:hanging="360"/>
+      </w:pPr>
+    </w:lvl>
+    <w:lvl w:ilvl="5" w:tplc="0C0A001B" w:tentative="1">
+      <w:start w:val="1"/>
+      <w:numFmt w:val="lowerRoman"/>
+      <w:lvlText w:val="%6."/>
+      <w:lvlJc w:val="right"/>
+      <w:pPr>
+        <w:ind w:left="3960" w:hanging="180"/>
+      </w:pPr>
+    </w:lvl>
+    <w:lvl w:ilvl="6" w:tplc="0C0A000F" w:tentative="1">
+      <w:start w:val="1"/>
+      <w:numFmt w:val="decimal"/>
+      <w:lvlText w:val="%7."/>
+      <w:lvlJc w:val="left"/>
+      <w:pPr>
+        <w:ind w:left="4680" w:hanging="360"/>
+      </w:pPr>
+    </w:lvl>
+    <w:lvl w:ilvl="7" w:tplc="0C0A0019" w:tentative="1">
+      <w:start w:val="1"/>
+      <w:numFmt w:val="lowerLetter"/>
+      <w:lvlText w:val="%8."/>
+      <w:lvlJc w:val="left"/>
+      <w:pPr>
+        <w:ind w:left="5400" w:hanging="360"/>
+      </w:pPr>
+    </w:lvl>
+    <w:lvl w:ilvl="8" w:tplc="0C0A001B" w:tentative="1">
+      <w:start w:val="1"/>
+      <w:numFmt w:val="lowerRoman"/>
+      <w:lvlText w:val="%9."/>
+      <w:lvlJc w:val="right"/>
+      <w:pPr>
+        <w:ind w:left="6120" w:hanging="180"/>
+      </w:pPr>
+    </w:lvl>
+  </w:abstractNum>
   <w:num w:numId="1" w16cid:durableId="815150158">
-    <w:abstractNumId w:val="0"/>
+    <w:abstractNumId w:val="3"/>
     <w:lvlOverride w:ilvl="0">
       <w:startOverride w:val="1"/>
     </w:lvlOverride>
+  </w:num>
+  <w:num w:numId="2" w16cid:durableId="1590314172">
+    <w:abstractNumId w:val="1"/>
+  </w:num>
+  <w:num w:numId="3" w16cid:durableId="1729954320">
+    <w:abstractNumId w:val="2"/>
+  </w:num>
+  <w:num w:numId="4" w16cid:durableId="698704125">
+    <w:abstractNumId w:val="0"/>
+  </w:num>
+  <w:num w:numId="5" w16cid:durableId="1786343350">
+    <w:abstractNumId w:val="4"/>
+  </w:num>
+  <w:num w:numId="6" w16cid:durableId="1646856187">
+    <w:abstractNumId w:val="5"/>
   </w:num>
 </w:numbering>
 </file>

</xml_diff>